<commit_message>
docs: ampliar la memoria y el manual de uso
- Actualizar DOC-Digital-Fit.docx y el manual de uso.
- Incluye por error archivos temporales de Word (~$*.docx, ~WRL*.tmp).
</commit_message>
<xml_diff>
--- a/Manual de uso y video explicativo/MANUAL DE USO Y FUNCIONAMIENTO -- DIGITAL - FIT.docx
+++ b/Manual de uso y video explicativo/MANUAL DE USO Y FUNCIONAMIENTO -- DIGITAL - FIT.docx
@@ -182,7 +182,7 @@
             </w:rPr>
             <w:fldChar w:fldCharType="separate"/>
           </w:r>
-          <w:hyperlink w:anchor="_Toc227148426" w:history="1">
+          <w:hyperlink w:anchor="_Toc227176178" w:history="1">
             <w:r>
               <w:rPr>
                 <w:rStyle w:val="Hipervnculo"/>
@@ -209,7 +209,7 @@
                 <w:noProof/>
                 <w:webHidden/>
               </w:rPr>
-              <w:instrText xml:space="preserve"> PAGEREF _Toc227148426 \h </w:instrText>
+              <w:instrText xml:space="preserve"> PAGEREF _Toc227176178 \h </w:instrText>
             </w:r>
             <w:r>
               <w:rPr>
@@ -252,7 +252,7 @@
               <w:lang w:eastAsia="es-ES"/>
             </w:rPr>
           </w:pPr>
-          <w:hyperlink w:anchor="_Toc227148427" w:history="1">
+          <w:hyperlink w:anchor="_Toc227176179" w:history="1">
             <w:r>
               <w:rPr>
                 <w:rStyle w:val="Hipervnculo"/>
@@ -279,7 +279,7 @@
                 <w:noProof/>
                 <w:webHidden/>
               </w:rPr>
-              <w:instrText xml:space="preserve"> PAGEREF _Toc227148427 \h </w:instrText>
+              <w:instrText xml:space="preserve"> PAGEREF _Toc227176179 \h </w:instrText>
             </w:r>
             <w:r>
               <w:rPr>
@@ -322,7 +322,7 @@
               <w:lang w:eastAsia="es-ES"/>
             </w:rPr>
           </w:pPr>
-          <w:hyperlink w:anchor="_Toc227148428" w:history="1">
+          <w:hyperlink w:anchor="_Toc227176180" w:history="1">
             <w:r>
               <w:rPr>
                 <w:rStyle w:val="Hipervnculo"/>
@@ -349,7 +349,7 @@
                 <w:noProof/>
                 <w:webHidden/>
               </w:rPr>
-              <w:instrText xml:space="preserve"> PAGEREF _Toc227148428 \h </w:instrText>
+              <w:instrText xml:space="preserve"> PAGEREF _Toc227176180 \h </w:instrText>
             </w:r>
             <w:r>
               <w:rPr>
@@ -392,7 +392,7 @@
               <w:lang w:eastAsia="es-ES"/>
             </w:rPr>
           </w:pPr>
-          <w:hyperlink w:anchor="_Toc227148429" w:history="1">
+          <w:hyperlink w:anchor="_Toc227176181" w:history="1">
             <w:r>
               <w:rPr>
                 <w:rStyle w:val="Hipervnculo"/>
@@ -419,7 +419,7 @@
                 <w:noProof/>
                 <w:webHidden/>
               </w:rPr>
-              <w:instrText xml:space="preserve"> PAGEREF _Toc227148429 \h </w:instrText>
+              <w:instrText xml:space="preserve"> PAGEREF _Toc227176181 \h </w:instrText>
             </w:r>
             <w:r>
               <w:rPr>
@@ -462,7 +462,7 @@
               <w:lang w:eastAsia="es-ES"/>
             </w:rPr>
           </w:pPr>
-          <w:hyperlink w:anchor="_Toc227148430" w:history="1">
+          <w:hyperlink w:anchor="_Toc227176182" w:history="1">
             <w:r>
               <w:rPr>
                 <w:rStyle w:val="Hipervnculo"/>
@@ -489,7 +489,7 @@
                 <w:noProof/>
                 <w:webHidden/>
               </w:rPr>
-              <w:instrText xml:space="preserve"> PAGEREF _Toc227148430 \h </w:instrText>
+              <w:instrText xml:space="preserve"> PAGEREF _Toc227176182 \h </w:instrText>
             </w:r>
             <w:r>
               <w:rPr>
@@ -532,7 +532,7 @@
               <w:lang w:eastAsia="es-ES"/>
             </w:rPr>
           </w:pPr>
-          <w:hyperlink w:anchor="_Toc227148431" w:history="1">
+          <w:hyperlink w:anchor="_Toc227176183" w:history="1">
             <w:r>
               <w:rPr>
                 <w:rStyle w:val="Hipervnculo"/>
@@ -559,7 +559,7 @@
                 <w:noProof/>
                 <w:webHidden/>
               </w:rPr>
-              <w:instrText xml:space="preserve"> PAGEREF _Toc227148431 \h </w:instrText>
+              <w:instrText xml:space="preserve"> PAGEREF _Toc227176183 \h </w:instrText>
             </w:r>
             <w:r>
               <w:rPr>
@@ -592,6 +592,286 @@
         </w:p>
         <w:p>
           <w:pPr>
+            <w:pStyle w:val="TDC2"/>
+            <w:tabs>
+              <w:tab w:val="right" w:leader="dot" w:pos="9060"/>
+            </w:tabs>
+            <w:rPr>
+              <w:rFonts w:asciiTheme="minorHAnsi" w:eastAsiaTheme="minorEastAsia" w:hAnsiTheme="minorHAnsi"/>
+              <w:noProof/>
+              <w:lang w:eastAsia="es-ES"/>
+            </w:rPr>
+          </w:pPr>
+          <w:hyperlink w:anchor="_Toc227176184" w:history="1">
+            <w:r>
+              <w:rPr>
+                <w:rStyle w:val="Hipervnculo"/>
+                <w:noProof/>
+              </w:rPr>
+              <w:t>Pantalla principal</w:t>
+            </w:r>
+            <w:r>
+              <w:rPr>
+                <w:noProof/>
+                <w:webHidden/>
+              </w:rPr>
+              <w:tab/>
+            </w:r>
+            <w:r>
+              <w:rPr>
+                <w:noProof/>
+                <w:webHidden/>
+              </w:rPr>
+              <w:fldChar w:fldCharType="begin"/>
+            </w:r>
+            <w:r>
+              <w:rPr>
+                <w:noProof/>
+                <w:webHidden/>
+              </w:rPr>
+              <w:instrText xml:space="preserve"> PAGEREF _Toc227176184 \h </w:instrText>
+            </w:r>
+            <w:r>
+              <w:rPr>
+                <w:noProof/>
+                <w:webHidden/>
+              </w:rPr>
+            </w:r>
+            <w:r>
+              <w:rPr>
+                <w:noProof/>
+                <w:webHidden/>
+              </w:rPr>
+              <w:fldChar w:fldCharType="separate"/>
+            </w:r>
+            <w:r>
+              <w:rPr>
+                <w:noProof/>
+                <w:webHidden/>
+              </w:rPr>
+              <w:t>9</w:t>
+            </w:r>
+            <w:r>
+              <w:rPr>
+                <w:noProof/>
+                <w:webHidden/>
+              </w:rPr>
+              <w:fldChar w:fldCharType="end"/>
+            </w:r>
+          </w:hyperlink>
+        </w:p>
+        <w:p>
+          <w:pPr>
+            <w:pStyle w:val="TDC2"/>
+            <w:tabs>
+              <w:tab w:val="right" w:leader="dot" w:pos="9060"/>
+            </w:tabs>
+            <w:rPr>
+              <w:rFonts w:asciiTheme="minorHAnsi" w:eastAsiaTheme="minorEastAsia" w:hAnsiTheme="minorHAnsi"/>
+              <w:noProof/>
+              <w:lang w:eastAsia="es-ES"/>
+            </w:rPr>
+          </w:pPr>
+          <w:hyperlink w:anchor="_Toc227176185" w:history="1">
+            <w:r>
+              <w:rPr>
+                <w:rStyle w:val="Hipervnculo"/>
+                <w:noProof/>
+              </w:rPr>
+              <w:t>Centros privados base</w:t>
+            </w:r>
+            <w:r>
+              <w:rPr>
+                <w:noProof/>
+                <w:webHidden/>
+              </w:rPr>
+              <w:tab/>
+            </w:r>
+            <w:r>
+              <w:rPr>
+                <w:noProof/>
+                <w:webHidden/>
+              </w:rPr>
+              <w:fldChar w:fldCharType="begin"/>
+            </w:r>
+            <w:r>
+              <w:rPr>
+                <w:noProof/>
+                <w:webHidden/>
+              </w:rPr>
+              <w:instrText xml:space="preserve"> PAGEREF _Toc227176185 \h </w:instrText>
+            </w:r>
+            <w:r>
+              <w:rPr>
+                <w:noProof/>
+                <w:webHidden/>
+              </w:rPr>
+            </w:r>
+            <w:r>
+              <w:rPr>
+                <w:noProof/>
+                <w:webHidden/>
+              </w:rPr>
+              <w:fldChar w:fldCharType="separate"/>
+            </w:r>
+            <w:r>
+              <w:rPr>
+                <w:noProof/>
+                <w:webHidden/>
+              </w:rPr>
+              <w:t>10</w:t>
+            </w:r>
+            <w:r>
+              <w:rPr>
+                <w:noProof/>
+                <w:webHidden/>
+              </w:rPr>
+              <w:fldChar w:fldCharType="end"/>
+            </w:r>
+          </w:hyperlink>
+        </w:p>
+        <w:p>
+          <w:pPr>
+            <w:pStyle w:val="TDC2"/>
+            <w:tabs>
+              <w:tab w:val="right" w:leader="dot" w:pos="9060"/>
+            </w:tabs>
+            <w:rPr>
+              <w:rFonts w:asciiTheme="minorHAnsi" w:eastAsiaTheme="minorEastAsia" w:hAnsiTheme="minorHAnsi"/>
+              <w:noProof/>
+              <w:lang w:eastAsia="es-ES"/>
+            </w:rPr>
+          </w:pPr>
+          <w:hyperlink w:anchor="_Toc227176186" w:history="1">
+            <w:r>
+              <w:rPr>
+                <w:rStyle w:val="Hipervnculo"/>
+                <w:noProof/>
+              </w:rPr>
+              <w:t>Mis centros</w:t>
+            </w:r>
+            <w:r>
+              <w:rPr>
+                <w:noProof/>
+                <w:webHidden/>
+              </w:rPr>
+              <w:tab/>
+            </w:r>
+            <w:r>
+              <w:rPr>
+                <w:noProof/>
+                <w:webHidden/>
+              </w:rPr>
+              <w:fldChar w:fldCharType="begin"/>
+            </w:r>
+            <w:r>
+              <w:rPr>
+                <w:noProof/>
+                <w:webHidden/>
+              </w:rPr>
+              <w:instrText xml:space="preserve"> PAGEREF _Toc227176186 \h </w:instrText>
+            </w:r>
+            <w:r>
+              <w:rPr>
+                <w:noProof/>
+                <w:webHidden/>
+              </w:rPr>
+            </w:r>
+            <w:r>
+              <w:rPr>
+                <w:noProof/>
+                <w:webHidden/>
+              </w:rPr>
+              <w:fldChar w:fldCharType="separate"/>
+            </w:r>
+            <w:r>
+              <w:rPr>
+                <w:noProof/>
+                <w:webHidden/>
+              </w:rPr>
+              <w:t>11</w:t>
+            </w:r>
+            <w:r>
+              <w:rPr>
+                <w:noProof/>
+                <w:webHidden/>
+              </w:rPr>
+              <w:fldChar w:fldCharType="end"/>
+            </w:r>
+          </w:hyperlink>
+        </w:p>
+        <w:p>
+          <w:pPr>
+            <w:pStyle w:val="TDC2"/>
+            <w:tabs>
+              <w:tab w:val="right" w:leader="dot" w:pos="9060"/>
+            </w:tabs>
+            <w:rPr>
+              <w:rFonts w:asciiTheme="minorHAnsi" w:eastAsiaTheme="minorEastAsia" w:hAnsiTheme="minorHAnsi"/>
+              <w:noProof/>
+              <w:lang w:eastAsia="es-ES"/>
+            </w:rPr>
+          </w:pPr>
+          <w:hyperlink w:anchor="_Toc227176187" w:history="1">
+            <w:r>
+              <w:rPr>
+                <w:rStyle w:val="Hipervnculo"/>
+                <w:noProof/>
+              </w:rPr>
+              <w:t>Lugares públicos base</w:t>
+            </w:r>
+            <w:r>
+              <w:rPr>
+                <w:noProof/>
+                <w:webHidden/>
+              </w:rPr>
+              <w:tab/>
+            </w:r>
+            <w:r>
+              <w:rPr>
+                <w:noProof/>
+                <w:webHidden/>
+              </w:rPr>
+              <w:fldChar w:fldCharType="begin"/>
+            </w:r>
+            <w:r>
+              <w:rPr>
+                <w:noProof/>
+                <w:webHidden/>
+              </w:rPr>
+              <w:instrText xml:space="preserve"> PAGEREF _Toc227176187 \h </w:instrText>
+            </w:r>
+            <w:r>
+              <w:rPr>
+                <w:noProof/>
+                <w:webHidden/>
+              </w:rPr>
+            </w:r>
+            <w:r>
+              <w:rPr>
+                <w:noProof/>
+                <w:webHidden/>
+              </w:rPr>
+              <w:fldChar w:fldCharType="separate"/>
+            </w:r>
+            <w:r>
+              <w:rPr>
+                <w:noProof/>
+                <w:webHidden/>
+              </w:rPr>
+              <w:t>12</w:t>
+            </w:r>
+            <w:r>
+              <w:rPr>
+                <w:noProof/>
+                <w:webHidden/>
+              </w:rPr>
+              <w:fldChar w:fldCharType="end"/>
+            </w:r>
+          </w:hyperlink>
+        </w:p>
+        <w:p>
+          <w:pPr>
             <w:rPr>
               <w:b/>
               <w:bCs/>
@@ -635,31 +915,16 @@
         <w:spacing w:line="278" w:lineRule="auto"/>
         <w:jc w:val="left"/>
       </w:pPr>
-      <w:r>
-        <w:fldChar w:fldCharType="begin"/>
-      </w:r>
-      <w:r>
-        <w:instrText xml:space="preserve"> TOC \h \z \c "Tabla" </w:instrText>
-      </w:r>
-      <w:r>
-        <w:fldChar w:fldCharType="separate"/>
-      </w:r>
-      <w:r>
-        <w:rPr>
-          <w:b/>
-          <w:bCs/>
-          <w:noProof/>
-        </w:rPr>
-        <w:t>No se encuentran elementos de tabla de ilustraciones.</w:t>
-      </w:r>
-      <w:r>
-        <w:rPr>
-          <w:b/>
-          <w:bCs/>
-          <w:noProof/>
-        </w:rPr>
-        <w:fldChar w:fldCharType="end"/>
-      </w:r>
+      <w:fldSimple w:instr=" TOC \h \z \c &quot;Tabla&quot; ">
+        <w:r>
+          <w:rPr>
+            <w:b/>
+            <w:bCs/>
+            <w:noProof/>
+          </w:rPr>
+          <w:t>No se encuentran elementos de tabla de ilustraciones.</w:t>
+        </w:r>
+      </w:fldSimple>
       <w:r>
         <w:br w:type="page"/>
       </w:r>
@@ -768,82 +1033,82 @@
         <w:pStyle w:val="Ttulo1"/>
         <w:jc w:val="center"/>
       </w:pPr>
-      <w:bookmarkStart w:id="0" w:name="_Toc227148426"/>
+      <w:bookmarkStart w:id="0" w:name="_Toc227176178"/>
       <w:r>
         <w:lastRenderedPageBreak/>
         <w:t>Introducción</w:t>
       </w:r>
       <w:bookmarkEnd w:id="0"/>
     </w:p>
+    <w:p/>
     <w:p>
       <w:pPr>
+        <w:spacing w:line="278" w:lineRule="auto"/>
         <w:jc w:val="center"/>
       </w:pPr>
       <w:r>
-        <w:t>El presente manual tiene como finalidad explicar de forma clara el funcionamiento general de la aplicación Digital-FIT, mostrando cómo se utiliza cada una de sus partes principales y qué puede hacer cada tipo de usuario dentro del sistema.</w:t>
+        <w:t>El presente manual tiene como finalidad explicar el funcionamiento del área de usuario de la aplicación Digital-FIT. En él se describe cómo acceder a la plataforma, qué apartados existen dentro de la aplicación y qué acciones puede realizar un usuario en cada uno de ellos.</w:t>
       </w:r>
     </w:p>
     <w:p>
       <w:pPr>
+        <w:spacing w:line="278" w:lineRule="auto"/>
         <w:jc w:val="center"/>
       </w:pPr>
-      <w:r>
-        <w:t>Digital-FIT es una aplicación web orientada al ámbito deportivo, creada con el objetivo de reunir en una sola plataforma varias funciones que normalmente suelen encontrarse repartidas en diferentes herramientas. Entre ellas se incluyen la consulta de centros privados, la búsqueda de lugares públicos donde practicar deporte, la gestión de entrenamientos personales, el uso de mapa interactivo, el sistema de valoraciones y el apartado de soporte.</w:t>
-      </w:r>
     </w:p>
     <w:p>
       <w:pPr>
+        <w:spacing w:line="278" w:lineRule="auto"/>
         <w:jc w:val="center"/>
       </w:pPr>
+      <w:r>
+        <w:t xml:space="preserve">Digital-FIT es una aplicación web orientada al ámbito deportivo que reúne en una sola plataforma distintas funciones relacionadas con la organización del entrenamiento y la consulta de espacios deportivos. </w:t>
+      </w:r>
     </w:p>
     <w:p>
       <w:pPr>
+        <w:spacing w:line="278" w:lineRule="auto"/>
         <w:jc w:val="center"/>
       </w:pPr>
-      <w:r>
-        <w:t>La aplicación está pensada para facilitar la organización deportiva de los usuarios y ayudarles a encontrar espacios donde entrenar de forma más sencilla, especialmente dentro del entorno de Valencia y la Comunidad Valenciana. De esta manera, Digital-FIT no solo actúa como buscador de instalaciones, sino también como una herramienta práctica de apoyo para el usuario.</w:t>
-      </w:r>
     </w:p>
     <w:p>
       <w:pPr>
+        <w:spacing w:line="278" w:lineRule="auto"/>
         <w:jc w:val="center"/>
       </w:pPr>
       <w:r>
-        <w:t>Este manual se ha elaborado como guía de uso y funcionamiento. Por ello, no se centra en aspectos internos de programación o código, sino en explicar de manera práctica cómo acceder a la aplicación, cómo moverse entre sus apartados y cómo utilizar correctamente las funciones disponibles.</w:t>
+        <w:t>A través de ella, el usuario puede consultar centros privados, lugares públicos, entrenamientos base, entrenamientos compartidos por la comunidad, gestionar sus propios elementos personales, valorar contenido, utilizar estadísticas automáticas y enviar incidencias o sugerencias mediante soporte.</w:t>
       </w:r>
     </w:p>
     <w:p>
       <w:pPr>
+        <w:spacing w:line="278" w:lineRule="auto"/>
         <w:jc w:val="center"/>
       </w:pPr>
     </w:p>
     <w:p>
       <w:pPr>
+        <w:spacing w:line="278" w:lineRule="auto"/>
         <w:jc w:val="center"/>
       </w:pPr>
       <w:r>
-        <w:t xml:space="preserve">A lo largo del documento se diferenciarán dos grandes perfiles de uso: el usuario normal y el administrador. En primer </w:t>
-      </w:r>
-      <w:r>
-        <w:t>lugar,</w:t>
-      </w:r>
-      <w:r>
-        <w:t xml:space="preserve"> se explicará el funcionamiento general de la aplicación desde el punto de vista del usuario, y después se detallarán las funciones específicas del panel de administración.</w:t>
+        <w:t>El objetivo principal de la aplicación es ofrecer una experiencia más centralizada y cómoda. En lugar de depender de varias herramientas distintas para buscar dónde entrenar, guardar información útil o llevar un control de la actividad realizada, el usuario puede realizar todas estas acciones desde un mismo entorno.</w:t>
       </w:r>
     </w:p>
     <w:p>
       <w:pPr>
+        <w:spacing w:line="278" w:lineRule="auto"/>
         <w:jc w:val="center"/>
       </w:pPr>
-      <w:r>
-        <w:t>El objetivo es que cualquier persona que lea este manual pueda entender la lógica general de Digital-FIT y utilizar la aplicación con facilidad, incluso sin haber visto antes el proyecto.</w:t>
-      </w:r>
     </w:p>
     <w:p>
       <w:pPr>
         <w:spacing w:line="278" w:lineRule="auto"/>
-        <w:jc w:val="left"/>
-      </w:pPr>
+        <w:jc w:val="center"/>
+      </w:pPr>
+      <w:r>
+        <w:t>Este manual se centra en explicar el uso práctico de la aplicación. Por ello, se describe cada apartado desde el punto de vista funcional, indicando para qué sirve, qué información muestra y qué acciones puede realizar el usuario dentro de él.</w:t>
+      </w:r>
       <w:r>
         <w:br w:type="page"/>
       </w:r>
@@ -853,7 +1118,7 @@
         <w:pStyle w:val="Ttulo1"/>
         <w:jc w:val="center"/>
       </w:pPr>
-      <w:bookmarkStart w:id="1" w:name="_Toc227148427"/>
+      <w:bookmarkStart w:id="1" w:name="_Toc227176179"/>
       <w:r>
         <w:lastRenderedPageBreak/>
         <w:t>Requisitos para usar la aplicación</w:t>
@@ -865,50 +1130,71 @@
         <w:jc w:val="left"/>
       </w:pPr>
       <w:r>
-        <w:t xml:space="preserve">Digital-FIT se ha desarrollado como una aplicación web, por lo que no requiere una instalación compleja en el equipo del usuario. </w:t>
+        <w:t>Digital-FIT se ha desarrollado como una aplicación web, por lo que no requiere una instalación compleja en el equipo del usuario. Su uso está pensado para realizarse directamente desde un navegador, de forma sencilla y accesible.</w:t>
       </w:r>
       <w:r>
         <w:br/>
       </w:r>
       <w:r>
         <w:br/>
-        <w:t>Para utilizar la aplicación correctamente es recomendable disponer de un navegador web actualizado, como Google Chrome, Microsoft Edge o Mozilla Firefox. Esto resulta importante porque algunas funciones de la aplicación, como la navegación entre pantallas, la carga dinámica de contenido o el uso del mapa interactivo, dependen de tecnologías web actuales que funcionan mejor en versiones recientes de los navegadores.</w:t>
+        <w:t>Para utilizar la aplicación correctamente es recomendable disponer de un navegador web actualizado, como Google Chrome, Microsoft Edge o Mozilla Firefox. Esto es importante porque parte del funcionamiento de Digital-FIT depende de tecnologías web actuales, especialmente en apartados como la navegación interna o el mapa interactivo.</w:t>
       </w:r>
       <w:r>
         <w:br/>
       </w:r>
       <w:r>
         <w:br/>
-        <w:t>También es necesario disponer de acceso a internet, ya que Digital-FIT trabaja con una arquitectura web en la que el usuario accede a la interfaz desde el navegador y esta se comunica con el servidor para obtener y guardar la información del sistema. Además, algunas funciones concretas, como el mapa interactivo y la búsqueda de ubicaciones, dependen del acceso a servicios web externos relacionados con mapas y localización.</w:t>
-      </w:r>
-      <w:r>
-        <w:br/>
-      </w:r>
-      <w:r>
-        <w:br/>
-        <w:t>Para utilizar las funciones privadas de la aplicación es necesario disponer de una cuenta de usuario. Sin iniciar sesión, el acceso queda limitado, ya que apartados como los entrenamientos personales, las valoraciones, los elementos guardados, las estadísticas personales o el soporte están asociados a la cuenta de cada usuario.</w:t>
-      </w:r>
-      <w:r>
-        <w:br/>
-      </w:r>
-      <w:r>
-        <w:br/>
-        <w:t>En el caso del mapa interactivo, también es importante que el navegador permita cargar correctamente contenido web externo. Esto permite mostrar el mapa, realizar búsquedas de direcciones y trabajar con coordenadas reales para guardar ubicaciones dentro de la aplicación.</w:t>
-      </w:r>
-      <w:r>
-        <w:br/>
-      </w:r>
-      <w:r>
-        <w:br/>
-        <w:t>En conjunto, los requisitos de uso de Digital-FIT son sencillos: disponer de un navegador actualizado, conexión a internet y una cuenta de usuario para acceder a las funciones privadas. Gracias a ello, la aplicación puede utilizarse de forma cómoda sin necesidad de instalar programas adicionales.</w:t>
+        <w:t xml:space="preserve">También es necesario disponer de conexión a internet para acceder a la aplicación y utilizar correctamente sus funciones. </w:t>
       </w:r>
     </w:p>
     <w:p>
       <w:pPr>
+        <w:jc w:val="left"/>
+      </w:pPr>
+      <w:r>
+        <w:t>Algunas de ellas, como el uso del mapa o la búsqueda de ubicaciones, dependen además de la carga de servicios externos relacionados con mapas y localización.</w:t>
+      </w:r>
+      <w:r>
+        <w:br/>
+      </w:r>
+      <w:r>
+        <w:br/>
+        <w:t>Para acceder a las funciones privadas del sistema es necesario disponer de una cuenta de usuario. Sin iniciar sesión, no será posible utilizar apartados personales como mis centros, mis lugares, mis entrenamientos, historial de entrenamientos, valoraciones, estadísticas automáticas o soporte.</w:t>
+      </w:r>
+      <w:r>
+        <w:br/>
+      </w:r>
+      <w:r>
+        <w:br/>
+        <w:t>En conjunto, los requisitos de uso de Digital-FIT son sencillos: disponer de un navegador actualizado, conexión a internet y una cuenta de usuario válida para acceder a las funciones privadas de la aplicación.</w:t>
+      </w:r>
+    </w:p>
+    <w:p>
+      <w:pPr>
+        <w:jc w:val="left"/>
+      </w:pPr>
+    </w:p>
+    <w:p>
+      <w:pPr>
+        <w:jc w:val="left"/>
+      </w:pPr>
+    </w:p>
+    <w:p>
+      <w:pPr>
+        <w:jc w:val="left"/>
+      </w:pPr>
+    </w:p>
+    <w:p>
+      <w:pPr>
+        <w:jc w:val="left"/>
+      </w:pPr>
+    </w:p>
+    <w:p>
+      <w:pPr>
         <w:pStyle w:val="Ttulo1"/>
         <w:jc w:val="center"/>
       </w:pPr>
-      <w:bookmarkStart w:id="2" w:name="_Toc227148428"/>
+      <w:bookmarkStart w:id="2" w:name="_Toc227176180"/>
       <w:r>
         <w:lastRenderedPageBreak/>
         <w:t>Acceso a la aplicación</w:t>
@@ -920,51 +1206,84 @@
         <w:jc w:val="left"/>
       </w:pPr>
       <w:r>
-        <w:t>El acceso a Digital-FIT se realiza desde la pantalla inicial de autenticación. Esta pantalla es el punto de entrada principal a la aplicación y desde ella el usuario puede iniciar sesión con una cuenta ya existente o acceder al formulario de registro para crear una nueva.</w:t>
+        <w:t>El acceso a Digital-FIT se realiza desde la pantalla inicial de autenticación. Desde esta pantalla, el usuario puede iniciar sesión con una cuenta existente o registrarse en caso de no disponer todavía de perfil dentro de la aplicación.</w:t>
       </w:r>
       <w:r>
         <w:br/>
-        <w:t>Si ya dispone de una cuenta, solo tiene que introducir sus credenciales en el formulario de inicio de sesión. Una vez validados los datos, el sistema permite el acceso a la aplicación y muestra las funciones correspondientes según el tipo de usuario.</w:t>
       </w:r>
       <w:r>
         <w:br/>
-        <w:t>Si el usuario todavía no dispone de cuenta, debe utilizar la opción de registro. En esta parte se solicitan los datos necesarios para crear un nuevo perfil. Una vez completado el proceso de alta, el usuario ya puede acceder a la aplicación con normalidad utilizando su correo y contraseña.</w:t>
+        <w:t>Si el usuario ya tiene cuenta, únicamente debe introducir sus credenciales en el formulario de inicio de sesión. Una vez comprobados los datos, la aplicación permite el acceso al entorno principal y habilita las funciones correspondientes.</w:t>
       </w:r>
       <w:r>
         <w:br/>
       </w:r>
       <w:r>
         <w:br/>
-        <w:t>Digital-FIT diferencia entre usuario normal y administrador. El usuario normal accede a las funciones habituales de uso de la aplicación, como consulta de centros y lugares, gestión de entrenamientos, uso del mapa, valoraciones y soporte. El administrador, además de estas funciones, dispone de acceso a las herramientas de gestión interna, como el panel de administración, la revisión de contenido, la gestión de incidencias y las estadísticas generales del sistema.</w:t>
-      </w:r>
-      <w:r>
-        <w:br/>
-        <w:t>El sistema controla el acceso a las zonas privadas de la aplicación. Esto significa que una persona que no haya iniciado sesión no puede acceder libremente a determinadas secciones, y que un usuario normal no puede entrar en apartados reservados al administrador. De esta forma, la aplicación mantiene separadas las funciones de uso general y las funciones de gestión.</w:t>
-      </w:r>
-      <w:r>
-        <w:br/>
-      </w:r>
-      <w:r>
-        <w:br/>
-        <w:t>Una vez iniciada la sesión, el usuario puede navegar por las distintas pantallas de la aplicación y utilizar sus funciones mientras la sesión permanezca activa. Cuando decide salir, puede cerrar sesión y volver a la pantalla inicial. A partir de ese momento, será necesario identificarse de nuevo para acceder a las funciones privadas.</w:t>
-      </w:r>
-      <w:r>
-        <w:br/>
-      </w:r>
-      <w:r>
-        <w:br/>
-        <w:t xml:space="preserve">En general, el acceso a Digital-FIT está planteado para ser sencillo, claro y </w:t>
-      </w:r>
-      <w:r>
-        <w:t>seguro.</w:t>
+        <w:t xml:space="preserve">Si el usuario todavía no dispone de cuenta, debe utilizar la opción de registro para crear un nuevo perfil. </w:t>
       </w:r>
     </w:p>
     <w:p>
       <w:pPr>
+        <w:jc w:val="left"/>
+      </w:pPr>
+      <w:r>
+        <w:t>Tras completar este proceso, ya podrá iniciar sesión y empezar a utilizar la aplicación.</w:t>
+      </w:r>
+      <w:r>
+        <w:br/>
+      </w:r>
+      <w:r>
+        <w:br/>
+        <w:t>El acceso mediante cuenta de usuario es importante porque muchas de las funciones de Digital-FIT están asociadas a la información personal de cada perfil.</w:t>
+      </w:r>
+    </w:p>
+    <w:p>
+      <w:pPr>
+        <w:jc w:val="left"/>
+      </w:pPr>
+      <w:r>
+        <w:t>Gracias a ello, la aplicación puede diferenciar correctamente qué centros, lugares, entrenamientos, valoraciones o tickets pertenecen a cada usuario.</w:t>
+      </w:r>
+      <w:r>
+        <w:br/>
+      </w:r>
+      <w:r>
+        <w:br/>
+        <w:t>Una vez iniciada la sesión, el usuario puede navegar por las distintas secciones de la aplicación y utilizar las funcionalidades disponibles hasta que decida cerrarla o salir de su cuenta.</w:t>
+      </w:r>
+    </w:p>
+    <w:p>
+      <w:pPr>
+        <w:jc w:val="left"/>
+      </w:pPr>
+    </w:p>
+    <w:p>
+      <w:pPr>
+        <w:jc w:val="left"/>
+      </w:pPr>
+    </w:p>
+    <w:p>
+      <w:pPr>
+        <w:jc w:val="left"/>
+      </w:pPr>
+    </w:p>
+    <w:p>
+      <w:pPr>
+        <w:jc w:val="left"/>
+      </w:pPr>
+    </w:p>
+    <w:p>
+      <w:pPr>
+        <w:jc w:val="left"/>
+      </w:pPr>
+    </w:p>
+    <w:p>
+      <w:pPr>
         <w:pStyle w:val="Ttulo1"/>
         <w:jc w:val="center"/>
       </w:pPr>
-      <w:bookmarkStart w:id="3" w:name="_Toc227148429"/>
+      <w:bookmarkStart w:id="3" w:name="_Toc227176181"/>
       <w:r>
         <w:lastRenderedPageBreak/>
         <w:t>Manual de Usuario</w:t>
@@ -975,7 +1294,7 @@
       <w:pPr>
         <w:pStyle w:val="Ttulo2"/>
       </w:pPr>
-      <w:bookmarkStart w:id="4" w:name="_Toc227148430"/>
+      <w:bookmarkStart w:id="4" w:name="_Toc227176182"/>
       <w:r>
         <w:t>Registro</w:t>
       </w:r>
@@ -1024,7 +1343,7 @@
       <w:r>
         <w:br w:type="page"/>
       </w:r>
-      <w:bookmarkStart w:id="5" w:name="_Toc227148431"/>
+      <w:bookmarkStart w:id="5" w:name="_Toc227176183"/>
       <w:r>
         <w:lastRenderedPageBreak/>
         <w:t>Inicio de sesión</w:t>
@@ -1068,7 +1387,7 @@
       </w:r>
       <w:r>
         <w:br/>
-        <w:t>El inicio de sesión es, por tanto, una parte fundamental de Digital-FIT, ya que permite proteger la información personal de cada usuario y controlar correctamente el acceso a las distintas secciones de la plataforma.</w:t>
+        <w:t>El inicio de sesión es, por tanto, una parte fundamental ya que permite proteger la información personal de cada usuario y controlar correctamente el acceso a las distintas secciones de la plataforma.</w:t>
       </w:r>
     </w:p>
     <w:p>
@@ -1079,6 +1398,424 @@
         </w:rPr>
       </w:pPr>
     </w:p>
+    <w:p>
+      <w:pPr>
+        <w:rPr>
+          <w:b/>
+          <w:bCs/>
+        </w:rPr>
+      </w:pPr>
+    </w:p>
+    <w:p>
+      <w:pPr>
+        <w:rPr>
+          <w:b/>
+          <w:bCs/>
+        </w:rPr>
+      </w:pPr>
+    </w:p>
+    <w:p>
+      <w:pPr>
+        <w:rPr>
+          <w:b/>
+          <w:bCs/>
+        </w:rPr>
+      </w:pPr>
+    </w:p>
+    <w:p>
+      <w:pPr>
+        <w:rPr>
+          <w:b/>
+          <w:bCs/>
+        </w:rPr>
+      </w:pPr>
+    </w:p>
+    <w:p>
+      <w:pPr>
+        <w:rPr>
+          <w:b/>
+          <w:bCs/>
+        </w:rPr>
+      </w:pPr>
+    </w:p>
+    <w:p>
+      <w:pPr>
+        <w:pStyle w:val="Ttulo2"/>
+      </w:pPr>
+      <w:bookmarkStart w:id="6" w:name="_Toc227176184"/>
+      <w:r>
+        <w:lastRenderedPageBreak/>
+        <w:t>Pantalla principal</w:t>
+      </w:r>
+      <w:bookmarkEnd w:id="6"/>
+    </w:p>
+    <w:p>
+      <w:pPr>
+        <w:spacing w:line="278" w:lineRule="auto"/>
+        <w:jc w:val="left"/>
+      </w:pPr>
+      <w:r>
+        <w:t>La pantalla principal actúa como punto central de navegación dentro de Digital-FIT. Desde ella, el usuario puede acceder a todos los apartados principales de la aplicación y moverse entre sus distintas funciones de forma rápida y clara.</w:t>
+      </w:r>
+      <w:r>
+        <w:br/>
+      </w:r>
+      <w:r>
+        <w:br/>
+        <w:t>Esta pantalla reúne los accesos a las secciones más importantes del sistema, como centros privados base, lugares públicos base, entrenamientos base, entrenamiento comunidad, mis centros, mis lugares, mis entrenamientos, historial de entrenamientos, valoraciones, estadísticas automáticas y soporte.</w:t>
+      </w:r>
+      <w:r>
+        <w:br/>
+      </w:r>
+      <w:r>
+        <w:br/>
+        <w:t>El objetivo de la pantalla principal es servir como base de navegación del usuario. Gracias a esta organización, no es necesario recorrer varias pantallas previas para llegar a las funciones principales, sino que la aplicación ofrece desde el inicio un acceso directo a sus apartados más importantes.</w:t>
+      </w:r>
+      <w:r>
+        <w:br/>
+      </w:r>
+      <w:r>
+        <w:br/>
+        <w:t xml:space="preserve">Además de facilitar la navegación, la pantalla principal ayuda a que el usuario comprenda la estructura general de Digital-FIT. </w:t>
+      </w:r>
+    </w:p>
+    <w:p>
+      <w:pPr>
+        <w:spacing w:line="278" w:lineRule="auto"/>
+        <w:jc w:val="left"/>
+      </w:pPr>
+      <w:r>
+        <w:t>Desde ella se entiende que la aplicación combina contenido base ofrecido por el sistema con contenido personal guardado por cada usuario, así como funciones complementarias relacionadas con valoraciones, seguimiento y soporte.</w:t>
+      </w:r>
+      <w:r>
+        <w:br/>
+      </w:r>
+      <w:r>
+        <w:br/>
+        <w:t>En conjunto, la pantalla principal cumple una función organizativa esencial dentro de la aplicación, ya que permite acceder de forma clara y rápida a todas las partes relevantes del entorno de usuario.</w:t>
+      </w:r>
+      <w:r>
+        <w:br w:type="page"/>
+      </w:r>
+    </w:p>
+    <w:p>
+      <w:pPr>
+        <w:pStyle w:val="Ttulo2"/>
+      </w:pPr>
+      <w:bookmarkStart w:id="7" w:name="_Toc227176185"/>
+      <w:r>
+        <w:lastRenderedPageBreak/>
+        <w:t>Centros privados base</w:t>
+      </w:r>
+      <w:bookmarkEnd w:id="7"/>
+    </w:p>
+    <w:p>
+      <w:pPr>
+        <w:spacing w:line="278" w:lineRule="auto"/>
+        <w:jc w:val="left"/>
+      </w:pPr>
+      <w:r>
+        <w:t>El apartado de centros privados base permite al usuario consultar el listado general de gimnasios e instalaciones deportivas privadas disponibles dentro de Digital-FIT. Esta sección funciona como una base común de información ofrecida por la propia aplicación y recoge centros que forman parte del contenido principal del sistema.</w:t>
+      </w:r>
+      <w:r>
+        <w:br/>
+      </w:r>
+      <w:r>
+        <w:br/>
+        <w:t xml:space="preserve">La finalidad de este apartado es que el usuario pueda explorar distintas instalaciones deportivas sin necesidad de acudir a herramientas externas. </w:t>
+      </w:r>
+    </w:p>
+    <w:p>
+      <w:pPr>
+        <w:spacing w:line="278" w:lineRule="auto"/>
+        <w:jc w:val="left"/>
+      </w:pPr>
+      <w:r>
+        <w:t>De esta manera, la aplicación reúne en un mismo entorno información útil sobre espacios privados donde entrenar, facilitando una consulta más rápida y organizada.</w:t>
+      </w:r>
+      <w:r>
+        <w:br/>
+      </w:r>
+      <w:r>
+        <w:br/>
+        <w:t>Dentro de esta sección, el usuario puede revisar el listado completo de centros privados y seleccionar aquellos que le interesen para acceder a una vista más detallada. En esa información ampliada se muestran datos relevantes como el nombre del centro, la dirección, la descripción, el horario, el precio u otra información útil para conocer mejor la instalación.</w:t>
+      </w:r>
+      <w:r>
+        <w:br/>
+      </w:r>
+      <w:r>
+        <w:br/>
+        <w:t>Este apartado no está pensado como una zona de edición por parte del usuario, sino como una base de consulta. Los centros que aparecen en ella forman parte del contenido general de la aplicación y son gestionados a nivel interno por la parte administrativa del sistema.</w:t>
+      </w:r>
+      <w:r>
+        <w:br/>
+      </w:r>
+      <w:r>
+        <w:br/>
+        <w:t xml:space="preserve">Además, esta sección se relaciona directamente con “Mis centros”, ya que el usuario puede utilizarla como punto de partida para seleccionar aquellos centros que quiera guardar dentro de su cuenta personal. </w:t>
+      </w:r>
+    </w:p>
+    <w:p>
+      <w:pPr>
+        <w:spacing w:line="278" w:lineRule="auto"/>
+        <w:jc w:val="left"/>
+      </w:pPr>
+      <w:r>
+        <w:t>De esta forma, Digital-FIT combina una base general de información con una organización personalizada adaptada a cada usuario.</w:t>
+      </w:r>
+      <w:r>
+        <w:br w:type="page"/>
+      </w:r>
+    </w:p>
+    <w:p>
+      <w:pPr>
+        <w:pStyle w:val="Ttulo2"/>
+      </w:pPr>
+      <w:bookmarkStart w:id="8" w:name="_Toc227176186"/>
+      <w:r>
+        <w:lastRenderedPageBreak/>
+        <w:t>Mis centros</w:t>
+      </w:r>
+      <w:bookmarkEnd w:id="8"/>
+    </w:p>
+    <w:p>
+      <w:pPr>
+        <w:spacing w:line="278" w:lineRule="auto"/>
+        <w:jc w:val="left"/>
+      </w:pPr>
+      <w:r>
+        <w:t>El apartado de mis centros está pensado para que el usuario pueda reunir en un espacio propio los centros privados que le interesan de forma personal. Esta sección recoge los centros que el usuario ha decidido añadir a su cuenta, tanto si proceden de la base general de la aplicación como si se han incorporado mediante el uso del mapa interactivo.</w:t>
+      </w:r>
+      <w:r>
+        <w:br/>
+      </w:r>
+      <w:r>
+        <w:br/>
+        <w:t>La función principal de este apartado es ofrecer una experiencia más personalizada. En lugar de tener que buscar cada vez un centro dentro del listado general, el usuario puede guardar aquellos que le resulten más útiles, cercanos o interesantes y tenerlos organizados dentro de su perfil.</w:t>
+      </w:r>
+      <w:r>
+        <w:br/>
+      </w:r>
+      <w:r>
+        <w:br/>
+        <w:t>Desde esta pantalla, el usuario puede consultar su listado personal de centros y acceder a la información detallada de cada uno cuando lo necesite. Esto facilita revisar la información de forma rápida y mantener mejor organizada su selección de instalaciones deportivas.</w:t>
+      </w:r>
+      <w:r>
+        <w:br/>
+      </w:r>
+      <w:r>
+        <w:br/>
+        <w:t xml:space="preserve">En el caso de los centros añadidos desde el mapa, este apartado también adquiere una función práctica importante, ya que actúa como el lugar donde se almacenan esas ubicaciones personalizadas una vez asociadas a la cuenta del usuario. </w:t>
+      </w:r>
+    </w:p>
+    <w:p>
+      <w:pPr>
+        <w:spacing w:line="278" w:lineRule="auto"/>
+        <w:jc w:val="left"/>
+      </w:pPr>
+      <w:r>
+        <w:t>De esta manera, “Mis centros” combina elementos procedentes del contenido base con elementos añadidos por el propio usuario.</w:t>
+      </w:r>
+      <w:r>
+        <w:br/>
+      </w:r>
+      <w:r>
+        <w:br/>
+        <w:t>En conjunto, esta sección refuerza una de las ideas principales de Digital-FIT: no solo mostrar información deportiva general, sino permitir que cada persona organice su propio espacio dentro de la aplicación según sus necesidades y preferencias.</w:t>
+      </w:r>
+      <w:r>
+        <w:br w:type="page"/>
+      </w:r>
+    </w:p>
+    <w:p>
+      <w:pPr>
+        <w:pStyle w:val="Ttulo2"/>
+        <w:jc w:val="left"/>
+      </w:pPr>
+      <w:bookmarkStart w:id="9" w:name="_Toc227176187"/>
+      <w:r>
+        <w:lastRenderedPageBreak/>
+        <w:t>Lugares públicos base</w:t>
+      </w:r>
+      <w:bookmarkEnd w:id="9"/>
+    </w:p>
+    <w:p>
+      <w:pPr>
+        <w:spacing w:line="278" w:lineRule="auto"/>
+        <w:jc w:val="left"/>
+      </w:pPr>
+      <w:r>
+        <w:t>El apartado de lugares públicos base permite consultar el listado general de espacios deportivos públicos incluidos en Digital-FIT. En esta sección se reúnen zonas abiertas, parques, pistas y otros lugares donde el usuario puede entrenar sin depender de un centro privado.</w:t>
+      </w:r>
+    </w:p>
+    <w:p>
+      <w:pPr>
+        <w:spacing w:line="278" w:lineRule="auto"/>
+        <w:jc w:val="left"/>
+      </w:pPr>
+    </w:p>
+    <w:p>
+      <w:pPr>
+        <w:spacing w:line="278" w:lineRule="auto"/>
+        <w:jc w:val="left"/>
+      </w:pPr>
+      <w:r>
+        <w:t xml:space="preserve">Esta parte de la aplicación amplía el enfoque de Digital-FIT, ya que no limita su utilidad únicamente a gimnasios o instalaciones cerradas. </w:t>
+      </w:r>
+    </w:p>
+    <w:p>
+      <w:pPr>
+        <w:spacing w:line="278" w:lineRule="auto"/>
+        <w:jc w:val="left"/>
+      </w:pPr>
+      <w:r>
+        <w:t>Gracias a ello, la aplicación también resulta útil para personas que practican deporte al aire libre o que buscan alternativas públicas para entrenar.</w:t>
+      </w:r>
+    </w:p>
+    <w:p>
+      <w:pPr>
+        <w:spacing w:line="278" w:lineRule="auto"/>
+        <w:jc w:val="left"/>
+      </w:pPr>
+    </w:p>
+    <w:p>
+      <w:pPr>
+        <w:spacing w:line="278" w:lineRule="auto"/>
+        <w:jc w:val="left"/>
+      </w:pPr>
+      <w:r>
+        <w:t>Desde esta sección, el usuario puede revisar el listado completo de lugares públicos disponibles y acceder a su información detallada. En esa vista ampliada se muestran datos como el nombre del lugar, la dirección, la descripción, el tipo de zona o cualquier otra información que ayude a entender mejor sus características.</w:t>
+      </w:r>
+    </w:p>
+    <w:p>
+      <w:pPr>
+        <w:spacing w:line="278" w:lineRule="auto"/>
+        <w:jc w:val="left"/>
+      </w:pPr>
+    </w:p>
+    <w:p>
+      <w:pPr>
+        <w:spacing w:line="278" w:lineRule="auto"/>
+        <w:jc w:val="left"/>
+      </w:pPr>
+      <w:r>
+        <w:t>Al igual que ocurre con los centros privados base, esta sección funciona como una base de consulta ofrecida por la aplicación. Los elementos que aparecen en ella forman parte del contenido general del sistema y no están pensados para ser modificados directamente por el usuario normal.</w:t>
+      </w:r>
+    </w:p>
+    <w:p>
+      <w:pPr>
+        <w:spacing w:line="278" w:lineRule="auto"/>
+        <w:jc w:val="left"/>
+      </w:pPr>
+    </w:p>
+    <w:p>
+      <w:pPr>
+        <w:spacing w:line="278" w:lineRule="auto"/>
+        <w:jc w:val="left"/>
+      </w:pPr>
+      <w:r>
+        <w:t>Además, este apartado se conecta con “Mis lugares”, ya que permite seleccionar aquellos espacios que el usuario quiera guardar dentro de su cuenta personal.</w:t>
+      </w:r>
+    </w:p>
+    <w:p>
+      <w:pPr>
+        <w:spacing w:line="278" w:lineRule="auto"/>
+        <w:jc w:val="left"/>
+      </w:pPr>
+      <w:r>
+        <w:t>Gracias a ello, Digital-FIT combina una base común de lugares deportivos con la posibilidad de crear una selección propia adaptada a cada perfil.</w:t>
+      </w:r>
+      <w:r>
+        <w:br w:type="page"/>
+      </w:r>
+    </w:p>
+    <w:p>
+      <w:pPr>
+        <w:pStyle w:val="Ttulo2"/>
+        <w:jc w:val="left"/>
+      </w:pPr>
+      <w:r>
+        <w:lastRenderedPageBreak/>
+        <w:t>Mis lugares</w:t>
+      </w:r>
+    </w:p>
+    <w:p>
+      <w:pPr>
+        <w:jc w:val="left"/>
+      </w:pPr>
+      <w:r>
+        <w:t>El apartado de mis lugares permite al usuario guardar y organizar una selección personal de espacios públicos o zonas deportivas al aire libre. Su funcionamiento es similar al de “Mis centros”, pero aplicado a lugares públicos dentro de la aplicación.</w:t>
+      </w:r>
+    </w:p>
+    <w:p>
+      <w:pPr>
+        <w:jc w:val="left"/>
+      </w:pPr>
+    </w:p>
+    <w:p>
+      <w:pPr>
+        <w:jc w:val="left"/>
+      </w:pPr>
+      <w:r>
+        <w:t>En esta sección aparecen los lugares que el usuario ha añadido a su cuenta. Estos lugares pueden proceder tanto del listado base de la aplicación como del uso del mapa interactivo, que permite incorporar ubicaciones reales de forma personalizada.</w:t>
+      </w:r>
+    </w:p>
+    <w:p>
+      <w:pPr>
+        <w:jc w:val="left"/>
+      </w:pPr>
+    </w:p>
+    <w:p>
+      <w:pPr>
+        <w:jc w:val="left"/>
+      </w:pPr>
+      <w:r>
+        <w:t>La finalidad principal de este apartado es ofrecer una organización más práctica dentro del perfil de usuario. En lugar de consultar siempre el listado general de lugares públicos, la persona puede reunir en un mismo espacio aquellos sitios que considera más útiles o que utiliza con más frecuencia para entrenar.</w:t>
+      </w:r>
+    </w:p>
+    <w:p>
+      <w:pPr>
+        <w:jc w:val="left"/>
+      </w:pPr>
+    </w:p>
+    <w:p>
+      <w:pPr>
+        <w:jc w:val="left"/>
+      </w:pPr>
+      <w:r>
+        <w:t xml:space="preserve">Desde esta pantalla, el usuario puede consultar el listado de sus lugares guardados y acceder al detalle de cada uno. </w:t>
+      </w:r>
+    </w:p>
+    <w:p>
+      <w:pPr>
+        <w:jc w:val="left"/>
+      </w:pPr>
+      <w:r>
+        <w:t>Esto facilita revisar la información cuando lo necesite y mantener una selección propia mejor adaptada a sus hábitos deportivos.</w:t>
+      </w:r>
+    </w:p>
+    <w:p>
+      <w:pPr>
+        <w:jc w:val="left"/>
+      </w:pPr>
+    </w:p>
+    <w:p>
+      <w:pPr>
+        <w:jc w:val="left"/>
+      </w:pPr>
+      <w:r>
+        <w:t xml:space="preserve">La utilidad de “Mis lugares” es especialmente importante en una aplicación como Digital-FIT, ya que permite combinar el contenido general ofrecido por el sistema con ubicaciones seleccionadas o añadidas por el propio usuario. </w:t>
+      </w:r>
+    </w:p>
+    <w:p>
+      <w:pPr>
+        <w:jc w:val="left"/>
+      </w:pPr>
+      <w:r>
+        <w:t>De esta forma, la experiencia de uso resulta más personalizada, cómoda y coherente con la idea principal de la aplicación.</w:t>
+      </w:r>
+    </w:p>
+    <w:p/>
     <w:p/>
     <w:sectPr>
       <w:pgSz w:w="11906" w:h="16838" w:code="9"/>

</xml_diff>